<commit_message>
Resolve RM12 API line: AvidXchange conduit, not a finding; drop candidate F12
- Yonatan's knowledge resolves the API contradiction: Avid runs on an active API and RM12 API is the only API line, so the ~$95/mo line is the Avid conduit (justified cost), not recoverable
- Candidate Finding 12 (recoverable-cost angle) dropped; no Camille email warranted
- Deliverable Section 02: inventory row -> Adopt/justified cost; note reframed from "contradiction to resolve" to resolved; closing summary two -> one open item; legend "Clarify" verdict removed
- F01 Phase-2 Open Access prerequisite language left intact (the legitimately-open Phase-2 question)
- PROGRESS.md Section 19 added + Section 16/17 trackers updated; .docx rebuilt

Co-Authored-By: Claude Opus 4.8 <noreply@anthropic.com>
</commit_message>
<xml_diff>
--- a/Pergola_Audit_Findings.docx
+++ b/Pergola_Audit_Findings.docx
@@ -1475,7 +1475,7 @@
           <w:sz w:val="22"/>
           <w:szCs w:val="22"/>
         </w:rPr>
-        <w:t xml:space="preserve">Brian's framing was whether Pergola is squeezing the juice out of what it already pays for. This is the complete inventory: every licensed add-on and major in-platform module, what it does today, and a verdict. Adopt means use it or keep using it; Fix means owned and used but misconfigured; Activate means owned but sitting idle; Investigate or Clarify means one question is still open with the team or the RM rep. Verdicts cross-reference the detailed findings (F01–F11).</w:t>
+        <w:t xml:space="preserve">Brian's framing was whether Pergola is squeezing the juice out of what it already pays for. This is the complete inventory: every licensed add-on and major in-platform module, what it does today, and a verdict. Adopt means use it or keep using it; Fix means owned and used but misconfigured; Activate means owned but sitting idle; Investigate means one question is still open with the team. Verdicts cross-reference the detailed findings (F01–F11).</w:t>
       </w:r>
     </w:p>
     <w:p>
@@ -2544,7 +2544,7 @@
                 <w:sz w:val="19"/>
                 <w:szCs w:val="19"/>
               </w:rPr>
-              <w:t xml:space="preserve">Open Access off per rep, yet $95 line billed — pending RM rep</w:t>
+              <w:t xml:space="preserve">Powers the active AvidXchange integration; the only API line billed</w:t>
             </w:r>
           </w:p>
         </w:tc>
@@ -2575,7 +2575,7 @@
                 <w:sz w:val="19"/>
                 <w:szCs w:val="19"/>
               </w:rPr>
-              <w:t xml:space="preserve">Clarify — paid vs. enabled (see note)</w:t>
+              <w:t xml:space="preserve">Adopt — justified cost (self-serve Open Access = Phase 2 only)</w:t>
             </w:r>
           </w:p>
         </w:tc>
@@ -2887,7 +2887,7 @@
           <w:sz w:val="22"/>
           <w:szCs w:val="22"/>
         </w:rPr>
-        <w:t xml:space="preserve">Note — a contradiction to resolve: the subscription carries a billed "RM12 API" line at roughly $95/month, yet the RM rep states API / Open Access is not enabled. Most likely the partner-integration API (powering AvidXchange and Zego) is active while the self-serve Open Access read layer is not — but it should be confirmed, because a paid line for a capability that cannot be used is either recoverable cost or a switch waiting to be turned on for the Phase 2 utility build.</w:t>
+        <w:t xml:space="preserve">Note on the RM12 API line: the billed "RM12 API" charge (roughly $95/month) powers the active AvidXchange integration — it is the conduit that integration runs on, and it is the only API line on the invoice — so it is a justified, in-use cost, not recoverable. What the RM rep flagged as not enabled is the separate self-serve Open Access read layer, which only comes into play if a future Phase 2 project pulls utility consumption into a reporting layer; that is a Phase 2 scoping question, not an open item here.</w:t>
       </w:r>
     </w:p>
     <w:p>
@@ -3901,7 +3901,7 @@
           <w:sz w:val="22"/>
           <w:szCs w:val="22"/>
         </w:rPr>
-        <w:t xml:space="preserve">The feature-level checks are now closed on the web client: rmService and rmInspection adoption, Unit Availability, and rmVoIP utilization are all resolved above. Two items remain open, both awaiting outside input rather than a further system check — the RM12 API / Open Access status (with the RM rep) and native Accounts Payable versus AvidXchange (with Chad).</w:t>
+        <w:t xml:space="preserve">The feature-level checks are now closed on the web client: rmService and rmInspection adoption, Unit Availability, rmVoIP utilization, and the RM12 API line (the AvidXchange conduit) are all resolved above. One item remains open, awaiting outside input rather than a further system check — native Accounts Payable versus AvidXchange, which the upcoming session with Chad will settle.</w:t>
       </w:r>
     </w:p>
     <w:p>

</xml_diff>